<commit_message>
Link the week 5 screenshots and report to their commit.
Each lab photo and the week 5 code file now has a tree, blob, and commit URL.

Co-authored-by: Cursor <cursoragent@cursor.com>
</commit_message>
<xml_diff>
--- a/application/docs/week05/week-05-application.docx
+++ b/application/docs/week05/week-05-application.docx
@@ -864,6 +864,594 @@
           </w:p>
         </w:tc>
       </w:tr>
+      <w:tr>
+        <w:tc>
+          <w:tcPr>
+            <w:tcW w:type="dxa" w:w="3812"/>
+          </w:tcPr>
+          <w:p>
+            <w:r>
+              <w:t>Thư mục tuần 5</w:t>
+            </w:r>
+          </w:p>
+        </w:tc>
+        <w:tc>
+          <w:tcPr>
+            <w:tcW w:type="dxa" w:w="3812"/>
+          </w:tcPr>
+          <w:p>
+            <w:r>
+              <w:t>Add the week 5 failure-handling report and lab screenshots.</w:t>
+            </w:r>
+          </w:p>
+        </w:tc>
+        <w:tc>
+          <w:tcPr>
+            <w:tcW w:type="dxa" w:w="3812"/>
+          </w:tcPr>
+          <w:p>
+            <w:r>
+              <w:t>https://github.com/Cucbong30/cloud-infrastructure-monitoring-automation/tree/695b0c7635ecd46a49130311933ec64f25560d23/application/docs/week05</w:t>
+            </w:r>
+          </w:p>
+        </w:tc>
+        <w:tc>
+          <w:tcPr>
+            <w:tcW w:type="dxa" w:w="3812"/>
+          </w:tcPr>
+          <w:p>
+            <w:r>
+              <w:t>https://github.com/Cucbong30/cloud-infrastructure-monitoring-automation/commit/695b0c7635ecd46a49130311933ec64f25560d23</w:t>
+            </w:r>
+          </w:p>
+        </w:tc>
+      </w:tr>
+      <w:tr>
+        <w:tc>
+          <w:tcPr>
+            <w:tcW w:type="dxa" w:w="3812"/>
+          </w:tcPr>
+          <w:p>
+            <w:r>
+              <w:t>Lỗi 23/10 giữ lại</w:t>
+            </w:r>
+          </w:p>
+        </w:tc>
+        <w:tc>
+          <w:tcPr>
+            <w:tcW w:type="dxa" w:w="3812"/>
+          </w:tcPr>
+          <w:p>
+            <w:r>
+              <w:t>APP01 Healthy, restart_container already ran, No route to host.</w:t>
+            </w:r>
+          </w:p>
+        </w:tc>
+        <w:tc>
+          <w:tcPr>
+            <w:tcW w:type="dxa" w:w="3812"/>
+          </w:tcPr>
+          <w:p>
+            <w:r>
+              <w:t>https://github.com/Cucbong30/cloud-infrastructure-monitoring-automation/blob/695b0c7635ecd46a49130311933ec64f25560d23/application/docs/week05/screenshots/08-app01-bug-no-precheck.jpg</w:t>
+            </w:r>
+          </w:p>
+        </w:tc>
+        <w:tc>
+          <w:tcPr>
+            <w:tcW w:type="dxa" w:w="3812"/>
+          </w:tcPr>
+          <w:p>
+            <w:r>
+              <w:t>https://github.com/Cucbong30/cloud-infrastructure-monitoring-automation/commit/695b0c7635ecd46a49130311933ec64f25560d23</w:t>
+            </w:r>
+          </w:p>
+        </w:tc>
+      </w:tr>
+      <w:tr>
+        <w:tc>
+          <w:tcPr>
+            <w:tcW w:type="dxa" w:w="3812"/>
+          </w:tcPr>
+          <w:p>
+            <w:r>
+              <w:t>APP01 Healthy, SSH DOWN</w:t>
+            </w:r>
+          </w:p>
+        </w:tc>
+        <w:tc>
+          <w:tcPr>
+            <w:tcW w:type="dxa" w:w="3812"/>
+          </w:tcPr>
+          <w:p>
+            <w:r>
+              <w:t>Remediation unavailable, playbook was not started.</w:t>
+            </w:r>
+          </w:p>
+        </w:tc>
+        <w:tc>
+          <w:tcPr>
+            <w:tcW w:type="dxa" w:w="3812"/>
+          </w:tcPr>
+          <w:p>
+            <w:r>
+              <w:t>https://github.com/Cucbong30/cloud-infrastructure-monitoring-automation/blob/695b0c7635ecd46a49130311933ec64f25560d23/application/docs/week05/screenshots/09-app01-healthy-ssh-down.jpg</w:t>
+            </w:r>
+          </w:p>
+        </w:tc>
+        <w:tc>
+          <w:tcPr>
+            <w:tcW w:type="dxa" w:w="3812"/>
+          </w:tcPr>
+          <w:p>
+            <w:r>
+              <w:t>https://github.com/Cucbong30/cloud-infrastructure-monitoring-automation/commit/695b0c7635ecd46a49130311933ec64f25560d23</w:t>
+            </w:r>
+          </w:p>
+        </w:tc>
+      </w:tr>
+      <w:tr>
+        <w:tc>
+          <w:tcPr>
+            <w:tcW w:type="dxa" w:w="3812"/>
+          </w:tcPr>
+          <w:p>
+            <w:r>
+              <w:t>SSH APP01 lên lại</w:t>
+            </w:r>
+          </w:p>
+        </w:tc>
+        <w:tc>
+          <w:tcPr>
+            <w:tcW w:type="dxa" w:w="3812"/>
+          </w:tcPr>
+          <w:p>
+            <w:r>
+              <w:t>Remediation available, Restart container can run.</w:t>
+            </w:r>
+          </w:p>
+        </w:tc>
+        <w:tc>
+          <w:tcPr>
+            <w:tcW w:type="dxa" w:w="3812"/>
+          </w:tcPr>
+          <w:p>
+            <w:r>
+              <w:t>https://github.com/Cucbong30/cloud-infrastructure-monitoring-automation/blob/695b0c7635ecd46a49130311933ec64f25560d23/application/docs/week05/screenshots/11-app01-ssh-restored.jpg</w:t>
+            </w:r>
+          </w:p>
+        </w:tc>
+        <w:tc>
+          <w:tcPr>
+            <w:tcW w:type="dxa" w:w="3812"/>
+          </w:tcPr>
+          <w:p>
+            <w:r>
+              <w:t>https://github.com/Cucbong30/cloud-infrastructure-monitoring-automation/commit/695b0c7635ecd46a49130311933ec64f25560d23</w:t>
+            </w:r>
+          </w:p>
+        </w:tc>
+      </w:tr>
+      <w:tr>
+        <w:tc>
+          <w:tcPr>
+            <w:tcW w:type="dxa" w:w="3812"/>
+          </w:tcPr>
+          <w:p>
+            <w:r>
+              <w:t>Job 20 Success</w:t>
+            </w:r>
+          </w:p>
+        </w:tc>
+        <w:tc>
+          <w:tcPr>
+            <w:tcW w:type="dxa" w:w="3812"/>
+          </w:tcPr>
+          <w:p>
+            <w:r>
+              <w:t>Verification Passed, App :8080 is up.</w:t>
+            </w:r>
+          </w:p>
+        </w:tc>
+        <w:tc>
+          <w:tcPr>
+            <w:tcW w:type="dxa" w:w="3812"/>
+          </w:tcPr>
+          <w:p>
+            <w:r>
+              <w:t>https://github.com/Cucbong30/cloud-infrastructure-monitoring-automation/blob/695b0c7635ecd46a49130311933ec64f25560d23/application/docs/week05/screenshots/12-job20-verification-success.jpg</w:t>
+            </w:r>
+          </w:p>
+        </w:tc>
+        <w:tc>
+          <w:tcPr>
+            <w:tcW w:type="dxa" w:w="3812"/>
+          </w:tcPr>
+          <w:p>
+            <w:r>
+              <w:t>https://github.com/Cucbong30/cloud-infrastructure-monitoring-automation/commit/695b0c7635ecd46a49130311933ec64f25560d23</w:t>
+            </w:r>
+          </w:p>
+        </w:tc>
+      </w:tr>
+      <w:tr>
+        <w:tc>
+          <w:tcPr>
+            <w:tcW w:type="dxa" w:w="3812"/>
+          </w:tcPr>
+          <w:p>
+            <w:r>
+              <w:t>Audit job 20</w:t>
+            </w:r>
+          </w:p>
+        </w:tc>
+        <w:tc>
+          <w:tcPr>
+            <w:tcW w:type="dxa" w:w="3812"/>
+          </w:tcPr>
+          <w:p>
+            <w:r>
+              <w:t>remediation.verified.</w:t>
+            </w:r>
+          </w:p>
+        </w:tc>
+        <w:tc>
+          <w:tcPr>
+            <w:tcW w:type="dxa" w:w="3812"/>
+          </w:tcPr>
+          <w:p>
+            <w:r>
+              <w:t>https://github.com/Cucbong30/cloud-infrastructure-monitoring-automation/blob/695b0c7635ecd46a49130311933ec64f25560d23/application/docs/week05/screenshots/15-job20-audit-verified.jpg</w:t>
+            </w:r>
+          </w:p>
+        </w:tc>
+        <w:tc>
+          <w:tcPr>
+            <w:tcW w:type="dxa" w:w="3812"/>
+          </w:tcPr>
+          <w:p>
+            <w:r>
+              <w:t>https://github.com/Cucbong30/cloud-infrastructure-monitoring-automation/commit/695b0c7635ecd46a49130311933ec64f25560d23</w:t>
+            </w:r>
+          </w:p>
+        </w:tc>
+      </w:tr>
+      <w:tr>
+        <w:tc>
+          <w:tcPr>
+            <w:tcW w:type="dxa" w:w="3812"/>
+          </w:tcPr>
+          <w:p>
+            <w:r>
+              <w:t>WIN01 WinRM down</w:t>
+            </w:r>
+          </w:p>
+        </w:tc>
+        <w:tc>
+          <w:tcPr>
+            <w:tcW w:type="dxa" w:w="3812"/>
+          </w:tcPr>
+          <w:p>
+            <w:r>
+              <w:t>Host Degraded, remediation unavailable.</w:t>
+            </w:r>
+          </w:p>
+        </w:tc>
+        <w:tc>
+          <w:tcPr>
+            <w:tcW w:type="dxa" w:w="3812"/>
+          </w:tcPr>
+          <w:p>
+            <w:r>
+              <w:t>https://github.com/Cucbong30/cloud-infrastructure-monitoring-automation/blob/695b0c7635ecd46a49130311933ec64f25560d23/application/docs/week05/screenshots/10-win01-degraded-winrm-down.jpg</w:t>
+            </w:r>
+          </w:p>
+        </w:tc>
+        <w:tc>
+          <w:tcPr>
+            <w:tcW w:type="dxa" w:w="3812"/>
+          </w:tcPr>
+          <w:p>
+            <w:r>
+              <w:t>https://github.com/Cucbong30/cloud-infrastructure-monitoring-automation/commit/695b0c7635ecd46a49130311933ec64f25560d23</w:t>
+            </w:r>
+          </w:p>
+        </w:tc>
+      </w:tr>
+      <w:tr>
+        <w:tc>
+          <w:tcPr>
+            <w:tcW w:type="dxa" w:w="3812"/>
+          </w:tcPr>
+          <w:p>
+            <w:r>
+              <w:t>WIN01 WinRM lên lại</w:t>
+            </w:r>
+          </w:p>
+        </w:tc>
+        <w:tc>
+          <w:tcPr>
+            <w:tcW w:type="dxa" w:w="3812"/>
+          </w:tcPr>
+          <w:p>
+            <w:r>
+              <w:t>WinRM UP, Restart Windows Exporter can run.</w:t>
+            </w:r>
+          </w:p>
+        </w:tc>
+        <w:tc>
+          <w:tcPr>
+            <w:tcW w:type="dxa" w:w="3812"/>
+          </w:tcPr>
+          <w:p>
+            <w:r>
+              <w:t>https://github.com/Cucbong30/cloud-infrastructure-monitoring-automation/blob/695b0c7635ecd46a49130311933ec64f25560d23/application/docs/week05/screenshots/13-win01-winrm-restored.jpg</w:t>
+            </w:r>
+          </w:p>
+        </w:tc>
+        <w:tc>
+          <w:tcPr>
+            <w:tcW w:type="dxa" w:w="3812"/>
+          </w:tcPr>
+          <w:p>
+            <w:r>
+              <w:t>https://github.com/Cucbong30/cloud-infrastructure-monitoring-automation/commit/695b0c7635ecd46a49130311933ec64f25560d23</w:t>
+            </w:r>
+          </w:p>
+        </w:tc>
+      </w:tr>
+      <w:tr>
+        <w:tc>
+          <w:tcPr>
+            <w:tcW w:type="dxa" w:w="3812"/>
+          </w:tcPr>
+          <w:p>
+            <w:r>
+              <w:t>App down và SSH down</w:t>
+            </w:r>
+          </w:p>
+        </w:tc>
+        <w:tc>
+          <w:tcPr>
+            <w:tcW w:type="dxa" w:w="3812"/>
+          </w:tcPr>
+          <w:p>
+            <w:r>
+              <w:t>Two separate log lines.</w:t>
+            </w:r>
+          </w:p>
+        </w:tc>
+        <w:tc>
+          <w:tcPr>
+            <w:tcW w:type="dxa" w:w="3812"/>
+          </w:tcPr>
+          <w:p>
+            <w:r>
+              <w:t>https://github.com/Cucbong30/cloud-infrastructure-monitoring-automation/blob/695b0c7635ecd46a49130311933ec64f25560d23/application/docs/week05/screenshots/14-app01-degraded-app-and-ssh.jpg</w:t>
+            </w:r>
+          </w:p>
+        </w:tc>
+        <w:tc>
+          <w:tcPr>
+            <w:tcW w:type="dxa" w:w="3812"/>
+          </w:tcPr>
+          <w:p>
+            <w:r>
+              <w:t>https://github.com/Cucbong30/cloud-infrastructure-monitoring-automation/commit/695b0c7635ecd46a49130311933ec64f25560d23</w:t>
+            </w:r>
+          </w:p>
+        </w:tc>
+      </w:tr>
+      <w:tr>
+        <w:tc>
+          <w:tcPr>
+            <w:tcW w:type="dxa" w:w="3812"/>
+          </w:tcPr>
+          <w:p>
+            <w:r>
+              <w:t>WEB01 blocked</w:t>
+            </w:r>
+          </w:p>
+        </w:tc>
+        <w:tc>
+          <w:tcPr>
+            <w:tcW w:type="dxa" w:w="3812"/>
+          </w:tcPr>
+          <w:p>
+            <w:r>
+              <w:t>remediation.blocked for restart_nginx.</w:t>
+            </w:r>
+          </w:p>
+        </w:tc>
+        <w:tc>
+          <w:tcPr>
+            <w:tcW w:type="dxa" w:w="3812"/>
+          </w:tcPr>
+          <w:p>
+            <w:r>
+              <w:t>https://github.com/Cucbong30/cloud-infrastructure-monitoring-automation/blob/695b0c7635ecd46a49130311933ec64f25560d23/application/docs/week05/screenshots/16-web01-blocked-audit.jpg</w:t>
+            </w:r>
+          </w:p>
+        </w:tc>
+        <w:tc>
+          <w:tcPr>
+            <w:tcW w:type="dxa" w:w="3812"/>
+          </w:tcPr>
+          <w:p>
+            <w:r>
+              <w:t>https://github.com/Cucbong30/cloud-infrastructure-monitoring-automation/commit/695b0c7635ecd46a49130311933ec64f25560d23</w:t>
+            </w:r>
+          </w:p>
+        </w:tc>
+      </w:tr>
+      <w:tr>
+        <w:tc>
+          <w:tcPr>
+            <w:tcW w:type="dxa" w:w="3812"/>
+          </w:tcPr>
+          <w:p>
+            <w:r>
+              <w:t>Alert gắn job</w:t>
+            </w:r>
+          </w:p>
+        </w:tc>
+        <w:tc>
+          <w:tcPr>
+            <w:tcW w:type="dxa" w:w="3812"/>
+          </w:tcPr>
+          <w:p>
+            <w:r>
+              <w:t>NginxDown linked to job 18 and job 19.</w:t>
+            </w:r>
+          </w:p>
+        </w:tc>
+        <w:tc>
+          <w:tcPr>
+            <w:tcW w:type="dxa" w:w="3812"/>
+          </w:tcPr>
+          <w:p>
+            <w:r>
+              <w:t>https://github.com/Cucbong30/cloud-infrastructure-monitoring-automation/blob/695b0c7635ecd46a49130311933ec64f25560d23/application/docs/week05/screenshots/05-alert-job-link.png</w:t>
+            </w:r>
+          </w:p>
+        </w:tc>
+        <w:tc>
+          <w:tcPr>
+            <w:tcW w:type="dxa" w:w="3812"/>
+          </w:tcPr>
+          <w:p>
+            <w:r>
+              <w:t>https://github.com/Cucbong30/cloud-infrastructure-monitoring-automation/commit/695b0c7635ecd46a49130311933ec64f25560d23</w:t>
+            </w:r>
+          </w:p>
+        </w:tc>
+      </w:tr>
+      <w:tr>
+        <w:tc>
+          <w:tcPr>
+            <w:tcW w:type="dxa" w:w="3812"/>
+          </w:tcPr>
+          <w:p>
+            <w:r>
+              <w:t>Job Detail blocked</w:t>
+            </w:r>
+          </w:p>
+        </w:tc>
+        <w:tc>
+          <w:tcPr>
+            <w:tcW w:type="dxa" w:w="3812"/>
+          </w:tcPr>
+          <w:p>
+            <w:r>
+              <w:t>Job 18 blocked, exit code empty.</w:t>
+            </w:r>
+          </w:p>
+        </w:tc>
+        <w:tc>
+          <w:tcPr>
+            <w:tcW w:type="dxa" w:w="3812"/>
+          </w:tcPr>
+          <w:p>
+            <w:r>
+              <w:t>https://github.com/Cucbong30/cloud-infrastructure-monitoring-automation/blob/695b0c7635ecd46a49130311933ec64f25560d23/application/docs/week05/screenshots/02-blocked-job-detail.png</w:t>
+            </w:r>
+          </w:p>
+        </w:tc>
+        <w:tc>
+          <w:tcPr>
+            <w:tcW w:type="dxa" w:w="3812"/>
+          </w:tcPr>
+          <w:p>
+            <w:r>
+              <w:t>https://github.com/Cucbong30/cloud-infrastructure-monitoring-automation/commit/695b0c7635ecd46a49130311933ec64f25560d23</w:t>
+            </w:r>
+          </w:p>
+        </w:tc>
+      </w:tr>
+      <w:tr>
+        <w:tc>
+          <w:tcPr>
+            <w:tcW w:type="dxa" w:w="3812"/>
+          </w:tcPr>
+          <w:p>
+            <w:r>
+              <w:t>Retry thành job mới</w:t>
+            </w:r>
+          </w:p>
+        </w:tc>
+        <w:tc>
+          <w:tcPr>
+            <w:tcW w:type="dxa" w:w="3812"/>
+          </w:tcPr>
+          <w:p>
+            <w:r>
+              <w:t>Job 19 retries job 18.</w:t>
+            </w:r>
+          </w:p>
+        </w:tc>
+        <w:tc>
+          <w:tcPr>
+            <w:tcW w:type="dxa" w:w="3812"/>
+          </w:tcPr>
+          <w:p>
+            <w:r>
+              <w:t>https://github.com/Cucbong30/cloud-infrastructure-monitoring-automation/blob/695b0c7635ecd46a49130311933ec64f25560d23/application/docs/week05/screenshots/04-retry-new-job.png</w:t>
+            </w:r>
+          </w:p>
+        </w:tc>
+        <w:tc>
+          <w:tcPr>
+            <w:tcW w:type="dxa" w:w="3812"/>
+          </w:tcPr>
+          <w:p>
+            <w:r>
+              <w:t>https://github.com/Cucbong30/cloud-infrastructure-monitoring-automation/commit/695b0c7635ecd46a49130311933ec64f25560d23</w:t>
+            </w:r>
+          </w:p>
+        </w:tc>
+      </w:tr>
+      <w:tr>
+        <w:tc>
+          <w:tcPr>
+            <w:tcW w:type="dxa" w:w="3812"/>
+          </w:tcPr>
+          <w:p>
+            <w:r>
+              <w:t>Audit job 18</w:t>
+            </w:r>
+          </w:p>
+        </w:tc>
+        <w:tc>
+          <w:tcPr>
+            <w:tcW w:type="dxa" w:w="3812"/>
+          </w:tcPr>
+          <w:p>
+            <w:r>
+              <w:t>job.result, remediation.blocked, job.request.</w:t>
+            </w:r>
+          </w:p>
+        </w:tc>
+        <w:tc>
+          <w:tcPr>
+            <w:tcW w:type="dxa" w:w="3812"/>
+          </w:tcPr>
+          <w:p>
+            <w:r>
+              <w:t>https://github.com/Cucbong30/cloud-infrastructure-monitoring-automation/blob/695b0c7635ecd46a49130311933ec64f25560d23/application/docs/week05/screenshots/03-audit-blocked.png</w:t>
+            </w:r>
+          </w:p>
+        </w:tc>
+        <w:tc>
+          <w:tcPr>
+            <w:tcW w:type="dxa" w:w="3812"/>
+          </w:tcPr>
+          <w:p>
+            <w:r>
+              <w:t>https://github.com/Cucbong30/cloud-infrastructure-monitoring-automation/commit/695b0c7635ecd46a49130311933ec64f25560d23</w:t>
+            </w:r>
+          </w:p>
+        </w:tc>
+      </w:tr>
     </w:tbl>
     <w:p/>
     <w:p>

</xml_diff>